<commit_message>
refactor: two-tier physics guardrail split (app + paper)
Tier 1 — Design Constraints (block before inference):
  Re, Ma, Eu, Da, Sc, Pe_m — computed from design params, gate the surrogate

Tier 2 — Physical Consistency Validators (check after prediction):
  Pr, Pe_h, Nu, Bi, Sh — validate post-inference, flag for CFD refinement

app.py:
  - Sidebar split: Tier 1 always visible; Tier 2 in collapsible expander
  - Guardrail results: separate PASS/FAIL blocks per tier with clear labels
  - [DESIGN CONSTRAINT] / [POST-PREDICTION VALIDATOR] in slider help text

Paper Section 4 rewritten:
  - Introduces two-tier distinction with honest rationale
  - Nu, Bi, Sh correctly labelled as derived/post-prediction quantities
  - Pr and Pe_h noted as essentially fixed / derived from other numbers

Co-Authored-By: Claude Sonnet 4.6 <noreply@anthropic.com>
</commit_message>
<xml_diff>
--- a/Paper/CFD_ALD_Paper_CEJ.docx
+++ b/Paper/CFD_ALD_Paper_CEJ.docx
@@ -15,7 +15,7 @@
           <w:color w:val="003366"/>
           <w:sz w:val="32"/>
         </w:rPr>
-        <w:t>A Physics-Guardrailed Dual-Track Surrogate Framework for Atomic Layer Deposition Showerhead Geometry Optimisation: Parametric Morphogenesis and Voxel-Implicit Constructive Solid Geometry Topology Search</w:t>
+        <w:t>A Physics-Guardrailed Dual-Track Surrogate Framework for Atomic Layer Deposition Showerhead Geometry Optimisation: Parametric Morphogenesis and Voxel-Implicit Constructive Solid Geometry Topology-Aware Search</w:t>
       </w:r>
     </w:p>
     <w:p>
@@ -49,7 +49,7 @@
         <w:br/>
         <w:t>ORCID: https://orcid.org/0009-0008-5998-6560</w:t>
         <w:br/>
-        <w:t>*Corresponding author  ·  May 2026</w:t>
+        <w:t>Jun 2026</w:t>
       </w:r>
     </w:p>
     <w:p/>
@@ -350,7 +350,43 @@
           <w:i w:val="0"/>
           <w:sz w:val="22"/>
         </w:rPr>
-        <w:t xml:space="preserve">, Pe_h, Pe_m, </w:t>
+        <w:t xml:space="preserve">, </w:t>
+      </w:r>
+      <w:r>
+        <w:rPr>
+          <w:rFonts w:ascii="Times New Roman" w:hAnsi="Times New Roman"/>
+          <w:b/>
+          <w:i w:val="0"/>
+          <w:sz w:val="22"/>
+        </w:rPr>
+        <w:t>Pe_h</w:t>
+      </w:r>
+      <w:r>
+        <w:rPr>
+          <w:rFonts w:ascii="Times New Roman" w:hAnsi="Times New Roman"/>
+          <w:b w:val="0"/>
+          <w:i w:val="0"/>
+          <w:sz w:val="22"/>
+        </w:rPr>
+        <w:t xml:space="preserve">, </w:t>
+      </w:r>
+      <w:r>
+        <w:rPr>
+          <w:rFonts w:ascii="Times New Roman" w:hAnsi="Times New Roman"/>
+          <w:b/>
+          <w:i w:val="0"/>
+          <w:sz w:val="22"/>
+        </w:rPr>
+        <w:t>Pe_m</w:t>
+      </w:r>
+      <w:r>
+        <w:rPr>
+          <w:rFonts w:ascii="Times New Roman" w:hAnsi="Times New Roman"/>
+          <w:b w:val="0"/>
+          <w:i w:val="0"/>
+          <w:sz w:val="22"/>
+        </w:rPr>
+        <w:t xml:space="preserve">, </w:t>
       </w:r>
       <w:r>
         <w:rPr>
@@ -1488,22 +1524,7 @@
           <w:i w:val="0"/>
           <w:sz w:val="22"/>
         </w:rPr>
-        <w:t>A key novelty is the explicit physics guardrail engine that validates every design before surrogate evaluation, preventing the optimizer from recommending physically invalid designs — a common failure mode of purely data-driven approaches. Each guardrail is a dimensionless number with a user-settable range.</w:t>
-      </w:r>
-    </w:p>
-    <w:p>
-      <w:pPr>
-        <w:spacing w:before="240" w:after="80"/>
-      </w:pPr>
-      <w:r>
-        <w:rPr>
-          <w:rFonts w:ascii="Times New Roman" w:hAnsi="Times New Roman"/>
-          <w:b/>
-          <w:i w:val="0"/>
-          <w:color w:val="005082"/>
-          <w:sz w:val="24"/>
-        </w:rPr>
-        <w:t>4.1 Momentum Transfer Guardrails</w:t>
+        <w:t>A key novelty is the explicit physics guardrail engine that validates every design before and after surrogate evaluation. We distinguish two tiers of dimensionless numbers with distinct roles in the pipeline:</w:t>
       </w:r>
     </w:p>
     <w:p>
@@ -1519,6 +1540,101 @@
           <w:i w:val="0"/>
           <w:sz w:val="22"/>
         </w:rPr>
+        <w:t xml:space="preserve">Tier 1 — Design constraints (Re, Ma, Eu, Da, Sc, Pe_m): </w:t>
+      </w:r>
+      <w:r>
+        <w:rPr>
+          <w:rFonts w:ascii="Times New Roman" w:hAnsi="Times New Roman"/>
+          <w:b w:val="0"/>
+          <w:i w:val="0"/>
+          <w:sz w:val="22"/>
+        </w:rPr>
+        <w:t>computed directly from design parameters before the surrogate runs. Violation means the design falls outside the surrogate's training regime — predictions are unreliable. These six numbers block or flag the design before inference.</w:t>
+      </w:r>
+    </w:p>
+    <w:p>
+      <w:pPr>
+        <w:pStyle w:val="ListBullet"/>
+        <w:spacing w:after="60"/>
+        <w:jc w:val="both"/>
+      </w:pPr>
+      <w:r>
+        <w:rPr>
+          <w:rFonts w:ascii="Times New Roman" w:hAnsi="Times New Roman"/>
+          <w:b/>
+          <w:i w:val="0"/>
+          <w:sz w:val="22"/>
+        </w:rPr>
+        <w:t xml:space="preserve">Tier 2 — Physical consistency validators (Pr, Pe_h, Nu, Bi, Sh): </w:t>
+      </w:r>
+      <w:r>
+        <w:rPr>
+          <w:rFonts w:ascii="Times New Roman" w:hAnsi="Times New Roman"/>
+          <w:b w:val="0"/>
+          <w:i w:val="0"/>
+          <w:sz w:val="22"/>
+        </w:rPr>
+        <w:t>validated after surrogate prediction using predicted field values. Violation does not block inference but flags the design for CFD refinement. These five numbers are either derived from the solution (Nu, Bi, Sh) or essentially fixed for a given gas mixture (Pr ≈ 0.71 for N₂, Pe_h = Re·Pr).</w:t>
+      </w:r>
+    </w:p>
+    <w:p>
+      <w:pPr>
+        <w:spacing w:before="240" w:after="80"/>
+      </w:pPr>
+      <w:r>
+        <w:rPr>
+          <w:rFonts w:ascii="Times New Roman" w:hAnsi="Times New Roman"/>
+          <w:b/>
+          <w:i w:val="0"/>
+          <w:color w:val="005082"/>
+          <w:sz w:val="24"/>
+        </w:rPr>
+        <w:t>4.1 Tier 1 — Design Constraints</w:t>
+      </w:r>
+    </w:p>
+    <w:p>
+      <w:pPr>
+        <w:spacing w:after="120"/>
+        <w:jc w:val="both"/>
+      </w:pPr>
+      <w:r>
+        <w:rPr>
+          <w:rFonts w:ascii="Times New Roman" w:hAnsi="Times New Roman"/>
+          <w:b w:val="0"/>
+          <w:i w:val="0"/>
+          <w:sz w:val="22"/>
+        </w:rPr>
+        <w:t>The following six numbers are evaluated before surrogate inference:</w:t>
+      </w:r>
+    </w:p>
+    <w:p>
+      <w:pPr>
+        <w:spacing w:before="240" w:after="80"/>
+      </w:pPr>
+      <w:r>
+        <w:rPr>
+          <w:rFonts w:ascii="Times New Roman" w:hAnsi="Times New Roman"/>
+          <w:b/>
+          <w:i w:val="0"/>
+          <w:color w:val="0064A0"/>
+          <w:sz w:val="22"/>
+        </w:rPr>
+        <w:t>4.1a Momentum Transfer</w:t>
+      </w:r>
+    </w:p>
+    <w:p>
+      <w:pPr>
+        <w:pStyle w:val="ListBullet"/>
+        <w:spacing w:after="60"/>
+        <w:jc w:val="both"/>
+      </w:pPr>
+      <w:r>
+        <w:rPr>
+          <w:rFonts w:ascii="Times New Roman" w:hAnsi="Times New Roman"/>
+          <w:b/>
+          <w:i w:val="0"/>
+          <w:sz w:val="22"/>
+        </w:rPr>
         <w:t xml:space="preserve">Reynolds Number Re = rho*V*D / mu: </w:t>
       </w:r>
       <w:r>
@@ -1533,8 +1649,8 @@
     </w:p>
     <w:tbl>
       <w:tblPr>
-        <w:tblW w:type="auto" w:w="0"/>
         <w:tblLook w:firstColumn="1" w:firstRow="1" w:lastColumn="0" w:lastRow="0" w:noHBand="0" w:noVBand="1" w:val="04A0"/>
+        <w:tblW w:type="pct" w:w="5000"/>
       </w:tblPr>
       <w:tblGrid>
         <w:gridCol w:w="8838"/>
@@ -1542,7 +1658,7 @@
       <w:tr>
         <w:tc>
           <w:tcPr>
-            <w:tcW w:type="dxa" w:w="8640"/>
+            <w:tcW w:type="dxa" w:w="8838"/>
             <w:shd w:val="clear" w:color="auto" w:fill="F2F3F4"/>
           </w:tcPr>
           <w:p>
@@ -1632,8 +1748,8 @@
     </w:p>
     <w:tbl>
       <w:tblPr>
-        <w:tblW w:type="auto" w:w="0"/>
         <w:tblLook w:firstColumn="1" w:firstRow="1" w:lastColumn="0" w:lastRow="0" w:noHBand="0" w:noVBand="1" w:val="04A0"/>
+        <w:tblW w:type="pct" w:w="5000"/>
       </w:tblPr>
       <w:tblGrid>
         <w:gridCol w:w="8838"/>
@@ -1641,7 +1757,7 @@
       <w:tr>
         <w:tc>
           <w:tcPr>
-            <w:tcW w:type="dxa" w:w="8640"/>
+            <w:tcW w:type="dxa" w:w="8838"/>
             <w:shd w:val="clear" w:color="auto" w:fill="F2F3F4"/>
           </w:tcPr>
           <w:p>
@@ -1688,10 +1804,10 @@
           <w:rFonts w:ascii="Times New Roman" w:hAnsi="Times New Roman"/>
           <w:b/>
           <w:i w:val="0"/>
-          <w:color w:val="005082"/>
-          <w:sz w:val="24"/>
-        </w:rPr>
-        <w:t>4.2 Heat Transfer Guardrails</w:t>
+          <w:color w:val="0064A0"/>
+          <w:sz w:val="22"/>
+        </w:rPr>
+        <w:t>4.1b Mass Transfer and ALD Kinetics (Tier 1)</w:t>
       </w:r>
     </w:p>
     <w:p>
@@ -1707,7 +1823,7 @@
           <w:i w:val="0"/>
           <w:sz w:val="22"/>
         </w:rPr>
-        <w:t xml:space="preserve">Prandtl Number Pr = cp*mu / k: </w:t>
+        <w:t xml:space="preserve">Schmidt Number Sc = mu / (rho * D_m): </w:t>
       </w:r>
       <w:r>
         <w:rPr>
@@ -1716,7 +1832,7 @@
           <w:i w:val="0"/>
           <w:sz w:val="22"/>
         </w:rPr>
-        <w:t>ratio of momentum diffusivity to thermal diffusivity. cp [J/(kg.K)] = specific heat, k [W/(m.K)] = thermal conductivity. Pr ≈ 0.71 for N2 at 393 K. Guards inconsistent fluid property specification.</w:t>
+        <w:t>[DESIGN CONSTRAINT] ratio of momentum to mass diffusivity. D_m [m^2/s] = TMA diffusivity in N2. Sc ≈ 1–3 for TMA/N2. Flags incorrect D_m specification.</w:t>
       </w:r>
     </w:p>
     <w:p>
@@ -1732,7 +1848,7 @@
           <w:i w:val="0"/>
           <w:sz w:val="22"/>
         </w:rPr>
-        <w:t xml:space="preserve">Nusselt Number Nu = h*L / k: </w:t>
+        <w:t xml:space="preserve">Peclet Number (mass) Pe_m = Re * Sc: </w:t>
       </w:r>
       <w:r>
         <w:rPr>
@@ -1741,128 +1857,13 @@
           <w:i w:val="0"/>
           <w:sz w:val="22"/>
         </w:rPr>
-        <w:t>ratio of convective to conductive heat transfer. h [W/(m^2.K)] = convective coefficient, L [m] = characteristic length. Bounds anchored to jet-impingement correlations [12].</w:t>
-      </w:r>
-    </w:p>
-    <w:p>
-      <w:pPr>
-        <w:pStyle w:val="ListBullet"/>
-        <w:spacing w:after="60"/>
-        <w:jc w:val="both"/>
-      </w:pPr>
-      <w:r>
-        <w:rPr>
-          <w:rFonts w:ascii="Times New Roman" w:hAnsi="Times New Roman"/>
-          <w:b/>
-          <w:i w:val="0"/>
-          <w:sz w:val="22"/>
-        </w:rPr>
-        <w:t xml:space="preserve">Biot Number Bi = h*L / k_s: </w:t>
-      </w:r>
-      <w:r>
-        <w:rPr>
-          <w:rFonts w:ascii="Times New Roman" w:hAnsi="Times New Roman"/>
-          <w:b w:val="0"/>
-          <w:i w:val="0"/>
-          <w:sz w:val="22"/>
-        </w:rPr>
-        <w:t>ratio of surface convection to faceplate internal conduction. k_s [W/(m.K)] = solid thermal conductivity. Bi &lt;&lt; 1 validates the uniform wall temperature boundary condition assumption.</w:t>
-      </w:r>
-    </w:p>
-    <w:p>
-      <w:pPr>
-        <w:spacing w:before="240" w:after="80"/>
-      </w:pPr>
-      <w:r>
-        <w:rPr>
-          <w:rFonts w:ascii="Times New Roman" w:hAnsi="Times New Roman"/>
-          <w:b/>
-          <w:i w:val="0"/>
-          <w:color w:val="005082"/>
-          <w:sz w:val="24"/>
-        </w:rPr>
-        <w:t>4.3 Mass Transfer and ALD Kinetics Guardrails</w:t>
-      </w:r>
-    </w:p>
-    <w:p>
-      <w:pPr>
-        <w:pStyle w:val="ListBullet"/>
-        <w:spacing w:after="60"/>
-        <w:jc w:val="both"/>
-      </w:pPr>
-      <w:r>
-        <w:rPr>
-          <w:rFonts w:ascii="Times New Roman" w:hAnsi="Times New Roman"/>
-          <w:b/>
-          <w:i w:val="0"/>
-          <w:sz w:val="22"/>
-        </w:rPr>
-        <w:t xml:space="preserve">Schmidt Number Sc = mu / (rho * D_m): </w:t>
-      </w:r>
-      <w:r>
-        <w:rPr>
-          <w:rFonts w:ascii="Times New Roman" w:hAnsi="Times New Roman"/>
-          <w:b w:val="0"/>
-          <w:i w:val="0"/>
-          <w:sz w:val="22"/>
-        </w:rPr>
-        <w:t>ratio of momentum diffusivity to mass diffusivity. D_m [m^2/s] = TMA diffusivity in N2. Sc ≈ 1–3 for TMA/N2. Guards diffusion-convection balance consistency.</w:t>
-      </w:r>
-    </w:p>
-    <w:p>
-      <w:pPr>
-        <w:pStyle w:val="ListBullet"/>
-        <w:spacing w:after="60"/>
-        <w:jc w:val="both"/>
-      </w:pPr>
-      <w:r>
-        <w:rPr>
-          <w:rFonts w:ascii="Times New Roman" w:hAnsi="Times New Roman"/>
-          <w:b/>
-          <w:i w:val="0"/>
-          <w:sz w:val="22"/>
-        </w:rPr>
-        <w:t xml:space="preserve">Sherwood Number Sh = k_m * L / D_m: </w:t>
-      </w:r>
-      <w:r>
-        <w:rPr>
-          <w:rFonts w:ascii="Times New Roman" w:hAnsi="Times New Roman"/>
-          <w:b w:val="0"/>
-          <w:i w:val="0"/>
-          <w:sz w:val="22"/>
-        </w:rPr>
-        <w:t>mass-transfer analogue of Nusselt. k_m [m/s] = mass transfer coefficient. Bounds anchored to the Mendeley Sh–Re–Sc dataset [13].</w:t>
-      </w:r>
-    </w:p>
-    <w:p>
-      <w:pPr>
-        <w:pStyle w:val="ListBullet"/>
-        <w:spacing w:after="60"/>
-        <w:jc w:val="both"/>
-      </w:pPr>
-      <w:r>
-        <w:rPr>
-          <w:rFonts w:ascii="Times New Roman" w:hAnsi="Times New Roman"/>
-          <w:b/>
-          <w:i w:val="0"/>
-          <w:sz w:val="22"/>
-        </w:rPr>
-        <w:t xml:space="preserve">Peclet Numbers Pe_h = Re*Pr  and  Pe_m = Re*Sc: </w:t>
-      </w:r>
-      <w:r>
-        <w:rPr>
-          <w:rFonts w:ascii="Times New Roman" w:hAnsi="Times New Roman"/>
-          <w:b w:val="0"/>
-          <w:i w:val="0"/>
-          <w:sz w:val="22"/>
-        </w:rPr>
-        <w:t>dimensionless advection-to-diffusion ratio for heat (Pe_h) and mass (Pe_m). ALD operates at Pe_m ≈ 0.1–10 (diffusion-important regime). Guards prevent evaluation outside training distribution.</w:t>
+        <w:t>[DESIGN CONSTRAINT] advection-to-diffusion ratio for mass transport. ALD operates at Pe_m ≈ 0.1–10 (diffusion-important). High Pe_m: convection dominates, uneven jets cannot be corrected by diffusion.</w:t>
       </w:r>
     </w:p>
     <w:tbl>
       <w:tblPr>
-        <w:tblW w:type="auto" w:w="0"/>
         <w:tblLook w:firstColumn="1" w:firstRow="1" w:lastColumn="0" w:lastRow="0" w:noHBand="0" w:noVBand="1" w:val="04A0"/>
+        <w:tblW w:type="pct" w:w="5000"/>
       </w:tblPr>
       <w:tblGrid>
         <w:gridCol w:w="8838"/>
@@ -1870,7 +1871,7 @@
       <w:tr>
         <w:tc>
           <w:tcPr>
-            <w:tcW w:type="dxa" w:w="8640"/>
+            <w:tcW w:type="dxa" w:w="8838"/>
             <w:shd w:val="clear" w:color="auto" w:fill="F2F3F4"/>
           </w:tcPr>
           <w:p>
@@ -1935,8 +1936,8 @@
     </w:p>
     <w:tbl>
       <w:tblPr>
-        <w:tblW w:type="auto" w:w="0"/>
         <w:tblLook w:firstColumn="1" w:firstRow="1" w:lastColumn="0" w:lastRow="0" w:noHBand="0" w:noVBand="1" w:val="04A0"/>
+        <w:tblW w:type="pct" w:w="5000"/>
       </w:tblPr>
       <w:tblGrid>
         <w:gridCol w:w="8838"/>
@@ -1944,7 +1945,7 @@
       <w:tr>
         <w:tc>
           <w:tcPr>
-            <w:tcW w:type="dxa" w:w="8640"/>
+            <w:tcW w:type="dxa" w:w="8838"/>
             <w:shd w:val="clear" w:color="auto" w:fill="F2F3F4"/>
           </w:tcPr>
           <w:p>
@@ -1991,6 +1992,251 @@
           <w:rFonts w:ascii="Times New Roman" w:hAnsi="Times New Roman"/>
           <w:b/>
           <w:i w:val="0"/>
+          <w:color w:val="005082"/>
+          <w:sz w:val="24"/>
+        </w:rPr>
+        <w:t>4.2 Tier 2 — Physical Consistency Validators</w:t>
+      </w:r>
+    </w:p>
+    <w:p>
+      <w:pPr>
+        <w:spacing w:after="120"/>
+        <w:jc w:val="both"/>
+      </w:pPr>
+      <w:r>
+        <w:rPr>
+          <w:rFonts w:ascii="Times New Roman" w:hAnsi="Times New Roman"/>
+          <w:b w:val="0"/>
+          <w:i w:val="0"/>
+          <w:sz w:val="22"/>
+        </w:rPr>
+        <w:t xml:space="preserve">The following five numbers are checked after surrogate prediction. Violation does not block inference but flags the design for </w:t>
+      </w:r>
+      <w:r>
+        <w:rPr>
+          <w:rFonts w:ascii="Times New Roman" w:hAnsi="Times New Roman"/>
+          <w:b w:val="0"/>
+          <w:i w:val="0"/>
+          <w:sz w:val="22"/>
+        </w:rPr>
+        <w:t>CFD</w:t>
+      </w:r>
+      <w:r>
+        <w:rPr>
+          <w:rFonts w:ascii="Times New Roman" w:hAnsi="Times New Roman"/>
+          <w:b w:val="0"/>
+          <w:i w:val="0"/>
+          <w:sz w:val="22"/>
+        </w:rPr>
+        <w:t xml:space="preserve"> refinement. Three of these (</w:t>
+      </w:r>
+      <w:r>
+        <w:rPr>
+          <w:rFonts w:ascii="Times New Roman" w:hAnsi="Times New Roman"/>
+          <w:b w:val="0"/>
+          <w:i w:val="0"/>
+          <w:sz w:val="22"/>
+        </w:rPr>
+        <w:t>Nu</w:t>
+      </w:r>
+      <w:r>
+        <w:rPr>
+          <w:rFonts w:ascii="Times New Roman" w:hAnsi="Times New Roman"/>
+          <w:b w:val="0"/>
+          <w:i w:val="0"/>
+          <w:sz w:val="22"/>
+        </w:rPr>
+        <w:t xml:space="preserve">, </w:t>
+      </w:r>
+      <w:r>
+        <w:rPr>
+          <w:rFonts w:ascii="Times New Roman" w:hAnsi="Times New Roman"/>
+          <w:b w:val="0"/>
+          <w:i w:val="0"/>
+          <w:sz w:val="22"/>
+        </w:rPr>
+        <w:t>Bi</w:t>
+      </w:r>
+      <w:r>
+        <w:rPr>
+          <w:rFonts w:ascii="Times New Roman" w:hAnsi="Times New Roman"/>
+          <w:b w:val="0"/>
+          <w:i w:val="0"/>
+          <w:sz w:val="22"/>
+        </w:rPr>
+        <w:t xml:space="preserve">, </w:t>
+      </w:r>
+      <w:r>
+        <w:rPr>
+          <w:rFonts w:ascii="Times New Roman" w:hAnsi="Times New Roman"/>
+          <w:b w:val="0"/>
+          <w:i w:val="0"/>
+          <w:sz w:val="22"/>
+        </w:rPr>
+        <w:t>Sh</w:t>
+      </w:r>
+      <w:r>
+        <w:rPr>
+          <w:rFonts w:ascii="Times New Roman" w:hAnsi="Times New Roman"/>
+          <w:b w:val="0"/>
+          <w:i w:val="0"/>
+          <w:sz w:val="22"/>
+        </w:rPr>
+        <w:t xml:space="preserve">) are results of the </w:t>
+      </w:r>
+      <w:r>
+        <w:rPr>
+          <w:rFonts w:ascii="Times New Roman" w:hAnsi="Times New Roman"/>
+          <w:b w:val="0"/>
+          <w:i w:val="0"/>
+          <w:sz w:val="22"/>
+        </w:rPr>
+        <w:t>CFD</w:t>
+      </w:r>
+      <w:r>
+        <w:rPr>
+          <w:rFonts w:ascii="Times New Roman" w:hAnsi="Times New Roman"/>
+          <w:b w:val="0"/>
+          <w:i w:val="0"/>
+          <w:sz w:val="22"/>
+        </w:rPr>
+        <w:t xml:space="preserve"> simulation, not quantities computable before solving — they validate the physical consistency of the surrogate's predictions against literature correlations.</w:t>
+      </w:r>
+    </w:p>
+    <w:p>
+      <w:pPr>
+        <w:pStyle w:val="ListBullet"/>
+        <w:spacing w:after="60"/>
+        <w:jc w:val="both"/>
+      </w:pPr>
+      <w:r>
+        <w:rPr>
+          <w:rFonts w:ascii="Times New Roman" w:hAnsi="Times New Roman"/>
+          <w:b/>
+          <w:i w:val="0"/>
+          <w:sz w:val="22"/>
+        </w:rPr>
+        <w:t xml:space="preserve">Prandtl Number Pr = cp*mu / k  [Tier 2]: </w:t>
+      </w:r>
+      <w:r>
+        <w:rPr>
+          <w:rFonts w:ascii="Times New Roman" w:hAnsi="Times New Roman"/>
+          <w:b w:val="0"/>
+          <w:i w:val="0"/>
+          <w:sz w:val="22"/>
+        </w:rPr>
+        <w:t>ratio of momentum to thermal diffusivity. Pr ≈ 0.71 for N2 at 393 K — essentially fixed for a given carrier gas. Acts as a fluid-property consistency check; rarely violated in practice.</w:t>
+      </w:r>
+    </w:p>
+    <w:p>
+      <w:pPr>
+        <w:pStyle w:val="ListBullet"/>
+        <w:spacing w:after="60"/>
+        <w:jc w:val="both"/>
+      </w:pPr>
+      <w:r>
+        <w:rPr>
+          <w:rFonts w:ascii="Times New Roman" w:hAnsi="Times New Roman"/>
+          <w:b/>
+          <w:i w:val="0"/>
+          <w:sz w:val="22"/>
+        </w:rPr>
+        <w:t xml:space="preserve">Peclet Number (heat) Pe_h = Re*Pr  [Tier 2]: </w:t>
+      </w:r>
+      <w:r>
+        <w:rPr>
+          <w:rFonts w:ascii="Times New Roman" w:hAnsi="Times New Roman"/>
+          <w:b w:val="0"/>
+          <w:i w:val="0"/>
+          <w:sz w:val="22"/>
+        </w:rPr>
+        <w:t>derived from Re and Pr — not an independent number. Validates that the advection-diffusion balance for heat is consistent with the training distribution.</w:t>
+      </w:r>
+    </w:p>
+    <w:p>
+      <w:pPr>
+        <w:pStyle w:val="ListBullet"/>
+        <w:spacing w:after="60"/>
+        <w:jc w:val="both"/>
+      </w:pPr>
+      <w:r>
+        <w:rPr>
+          <w:rFonts w:ascii="Times New Roman" w:hAnsi="Times New Roman"/>
+          <w:b/>
+          <w:i w:val="0"/>
+          <w:sz w:val="22"/>
+        </w:rPr>
+        <w:t xml:space="preserve">Nusselt Number Nu = h*L / k  [Tier 2]: </w:t>
+      </w:r>
+      <w:r>
+        <w:rPr>
+          <w:rFonts w:ascii="Times New Roman" w:hAnsi="Times New Roman"/>
+          <w:b w:val="0"/>
+          <w:i w:val="0"/>
+          <w:sz w:val="22"/>
+        </w:rPr>
+        <w:t>ratio of convective to conductive heat transfer. Computed from the predicted temperature field after inference. Bounds anchored to jet-impingement correlations [12].</w:t>
+      </w:r>
+    </w:p>
+    <w:p>
+      <w:pPr>
+        <w:pStyle w:val="ListBullet"/>
+        <w:spacing w:after="60"/>
+        <w:jc w:val="both"/>
+      </w:pPr>
+      <w:r>
+        <w:rPr>
+          <w:rFonts w:ascii="Times New Roman" w:hAnsi="Times New Roman"/>
+          <w:b/>
+          <w:i w:val="0"/>
+          <w:sz w:val="22"/>
+        </w:rPr>
+        <w:t xml:space="preserve">Biot Number Bi = h*L / k_s  [Tier 2]: </w:t>
+      </w:r>
+      <w:r>
+        <w:rPr>
+          <w:rFonts w:ascii="Times New Roman" w:hAnsi="Times New Roman"/>
+          <w:b w:val="0"/>
+          <w:i w:val="0"/>
+          <w:sz w:val="22"/>
+        </w:rPr>
+        <w:t>ratio of surface convection to faceplate internal conduction. k_s [W/(m.K)] = solid thermal conductivity. Bi &lt;&lt; 1 validates the uniform wall temperature boundary condition assumed during CFD and inference.</w:t>
+      </w:r>
+    </w:p>
+    <w:p>
+      <w:pPr>
+        <w:pStyle w:val="ListBullet"/>
+        <w:spacing w:after="60"/>
+        <w:jc w:val="both"/>
+      </w:pPr>
+      <w:r>
+        <w:rPr>
+          <w:rFonts w:ascii="Times New Roman" w:hAnsi="Times New Roman"/>
+          <w:b/>
+          <w:i w:val="0"/>
+          <w:sz w:val="22"/>
+        </w:rPr>
+        <w:t xml:space="preserve">Sherwood Number Sh = k_m*L / D_m  [Tier 2]: </w:t>
+      </w:r>
+      <w:r>
+        <w:rPr>
+          <w:rFonts w:ascii="Times New Roman" w:hAnsi="Times New Roman"/>
+          <w:b w:val="0"/>
+          <w:i w:val="0"/>
+          <w:sz w:val="22"/>
+        </w:rPr>
+        <w:t>mass-transfer analogue of Nusselt. k_m [m/s] = mass transfer coefficient. Computed from species field after inference. Bounds anchored to the Mendeley Sh–Re–Sc dataset [13].</w:t>
+      </w:r>
+    </w:p>
+    <w:p>
+      <w:pPr>
+        <w:spacing w:before="240" w:after="80"/>
+      </w:pPr>
+      <w:r>
+        <w:rPr>
+          <w:rFonts w:ascii="Times New Roman" w:hAnsi="Times New Roman"/>
+          <w:b/>
+          <w:i w:val="0"/>
           <w:color w:val="003366"/>
           <w:sz w:val="28"/>
         </w:rPr>
@@ -2584,8 +2830,8 @@
     </w:p>
     <w:tbl>
       <w:tblPr>
-        <w:tblW w:type="auto" w:w="0"/>
         <w:tblLook w:firstColumn="1" w:firstRow="1" w:lastColumn="0" w:lastRow="0" w:noHBand="0" w:noVBand="1" w:val="04A0"/>
+        <w:tblW w:type="pct" w:w="5000"/>
       </w:tblPr>
       <w:tblGrid>
         <w:gridCol w:w="8838"/>
@@ -2845,8 +3091,8 @@
     </w:p>
     <w:tbl>
       <w:tblPr>
-        <w:tblW w:type="auto" w:w="0"/>
         <w:tblLook w:firstColumn="1" w:firstRow="1" w:lastColumn="0" w:lastRow="0" w:noHBand="0" w:noVBand="1" w:val="04A0"/>
+        <w:tblW w:type="pct" w:w="5000"/>
       </w:tblPr>
       <w:tblGrid>
         <w:gridCol w:w="8838"/>
@@ -2854,7 +3100,7 @@
       <w:tr>
         <w:tc>
           <w:tcPr>
-            <w:tcW w:type="dxa" w:w="8640"/>
+            <w:tcW w:type="dxa" w:w="8838"/>
             <w:shd w:val="clear" w:color="auto" w:fill="F2F3F4"/>
           </w:tcPr>
           <w:p>
@@ -3032,8 +3278,8 @@
     </w:p>
     <w:tbl>
       <w:tblPr>
-        <w:tblW w:type="auto" w:w="0"/>
         <w:tblLook w:firstColumn="1" w:firstRow="1" w:lastColumn="0" w:lastRow="0" w:noHBand="0" w:noVBand="1" w:val="04A0"/>
+        <w:tblW w:type="pct" w:w="5000"/>
       </w:tblPr>
       <w:tblGrid>
         <w:gridCol w:w="8838"/>
@@ -3041,7 +3287,7 @@
       <w:tr>
         <w:tc>
           <w:tcPr>
-            <w:tcW w:type="dxa" w:w="8640"/>
+            <w:tcW w:type="dxa" w:w="8838"/>
             <w:shd w:val="clear" w:color="auto" w:fill="F2F3F4"/>
           </w:tcPr>
           <w:p>
@@ -3523,7 +3769,43 @@
           <w:i w:val="0"/>
           <w:sz w:val="22"/>
         </w:rPr>
-        <w:t xml:space="preserve">Figure 2 shows the GA convergence curve, Pareto front comparison, and best-per-type bar chart. The GA consistently outperforms random search across all topology types, demonstrating that guided, Catalan-aware topology search extracts further value from the same surrogate model without any additional </w:t>
+        <w:t xml:space="preserve">Figure 2 shows the </w:t>
+      </w:r>
+      <w:r>
+        <w:rPr>
+          <w:rFonts w:ascii="Times New Roman" w:hAnsi="Times New Roman"/>
+          <w:b/>
+          <w:i w:val="0"/>
+          <w:sz w:val="22"/>
+        </w:rPr>
+        <w:t>GA</w:t>
+      </w:r>
+      <w:r>
+        <w:rPr>
+          <w:rFonts w:ascii="Times New Roman" w:hAnsi="Times New Roman"/>
+          <w:b w:val="0"/>
+          <w:i w:val="0"/>
+          <w:sz w:val="22"/>
+        </w:rPr>
+        <w:t xml:space="preserve"> convergence curve, Pareto front comparison, and best-per-type bar chart. The </w:t>
+      </w:r>
+      <w:r>
+        <w:rPr>
+          <w:rFonts w:ascii="Times New Roman" w:hAnsi="Times New Roman"/>
+          <w:b w:val="0"/>
+          <w:i w:val="0"/>
+          <w:sz w:val="22"/>
+        </w:rPr>
+        <w:t>GA</w:t>
+      </w:r>
+      <w:r>
+        <w:rPr>
+          <w:rFonts w:ascii="Times New Roman" w:hAnsi="Times New Roman"/>
+          <w:b w:val="0"/>
+          <w:i w:val="0"/>
+          <w:sz w:val="22"/>
+        </w:rPr>
+        <w:t xml:space="preserve"> consistently outperforms random search across all topology types, demonstrating that guided, Catalan-aware topology search extracts further value from the same surrogate model without any additional </w:t>
       </w:r>
       <w:r>
         <w:rPr>
@@ -3546,8 +3828,8 @@
     </w:p>
     <w:tbl>
       <w:tblPr>
-        <w:tblW w:type="auto" w:w="0"/>
         <w:tblLook w:firstColumn="1" w:firstRow="1" w:lastColumn="0" w:lastRow="0" w:noHBand="0" w:noVBand="1" w:val="04A0"/>
+        <w:tblW w:type="pct" w:w="5000"/>
       </w:tblPr>
       <w:tblGrid>
         <w:gridCol w:w="8838"/>
@@ -3555,7 +3837,7 @@
       <w:tr>
         <w:tc>
           <w:tcPr>
-            <w:tcW w:type="dxa" w:w="8640"/>
+            <w:tcW w:type="dxa" w:w="8838"/>
             <w:shd w:val="clear" w:color="auto" w:fill="F2F3F4"/>
           </w:tcPr>
           <w:p>
@@ -4172,8 +4454,8 @@
     </w:p>
     <w:tbl>
       <w:tblPr>
-        <w:tblW w:type="auto" w:w="0"/>
         <w:tblLook w:firstColumn="1" w:firstRow="1" w:lastColumn="0" w:lastRow="0" w:noHBand="0" w:noVBand="1" w:val="04A0"/>
+        <w:tblW w:type="pct" w:w="5000"/>
       </w:tblPr>
       <w:tblGrid>
         <w:gridCol w:w="8838"/>
@@ -4230,7 +4512,7 @@
           <w:i w:val="0"/>
           <w:sz w:val="22"/>
         </w:rPr>
-        <w:t xml:space="preserve">Notably, the GA identifies a different best topology than random search: random search selects Type C (annular rings, </w:t>
+        <w:t xml:space="preserve">Notably, the </w:t>
       </w:r>
       <w:r>
         <w:rPr>
@@ -4239,6 +4521,24 @@
           <w:i w:val="0"/>
           <w:sz w:val="22"/>
         </w:rPr>
+        <w:t>GA</w:t>
+      </w:r>
+      <w:r>
+        <w:rPr>
+          <w:rFonts w:ascii="Times New Roman" w:hAnsi="Times New Roman"/>
+          <w:b w:val="0"/>
+          <w:i w:val="0"/>
+          <w:sz w:val="22"/>
+        </w:rPr>
+        <w:t xml:space="preserve"> identifies a different best topology than random search: random search selects Type C (annular rings, </w:t>
+      </w:r>
+      <w:r>
+        <w:rPr>
+          <w:rFonts w:ascii="Times New Roman" w:hAnsi="Times New Roman"/>
+          <w:b w:val="0"/>
+          <w:i w:val="0"/>
+          <w:sz w:val="22"/>
+        </w:rPr>
         <w:t>TMA</w:t>
       </w:r>
       <w:r>
@@ -4248,7 +4548,7 @@
           <w:i w:val="0"/>
           <w:sz w:val="22"/>
         </w:rPr>
-        <w:t xml:space="preserve">-UI = 0.895), while the GA evolves to Type A (baffled plenum, </w:t>
+        <w:t xml:space="preserve">-UI = 0.895), while the </w:t>
       </w:r>
       <w:r>
         <w:rPr>
@@ -4257,6 +4557,24 @@
           <w:i w:val="0"/>
           <w:sz w:val="22"/>
         </w:rPr>
+        <w:t>GA</w:t>
+      </w:r>
+      <w:r>
+        <w:rPr>
+          <w:rFonts w:ascii="Times New Roman" w:hAnsi="Times New Roman"/>
+          <w:b w:val="0"/>
+          <w:i w:val="0"/>
+          <w:sz w:val="22"/>
+        </w:rPr>
+        <w:t xml:space="preserve"> evolves to Type A (baffled plenum, </w:t>
+      </w:r>
+      <w:r>
+        <w:rPr>
+          <w:rFonts w:ascii="Times New Roman" w:hAnsi="Times New Roman"/>
+          <w:b w:val="0"/>
+          <w:i w:val="0"/>
+          <w:sz w:val="22"/>
+        </w:rPr>
         <w:t>TMA</w:t>
       </w:r>
       <w:r>
@@ -4266,7 +4584,25 @@
           <w:i w:val="0"/>
           <w:sz w:val="22"/>
         </w:rPr>
-        <w:t>-UI = 0.971) with a precisely optimised baffle position (baffle_frac = 0.42, placing the baffle near the lower third of the plenum). This result demonstrates that the GA's guided evolution across both topology type and continuous parameters simultaneously finds designs that pure random sampling over a fixed type cannot reach.</w:t>
+        <w:t xml:space="preserve">-UI = 0.971) with a precisely optimised baffle position (baffle_frac = 0.42, placing the baffle near the lower third of the plenum). This result demonstrates that the </w:t>
+      </w:r>
+      <w:r>
+        <w:rPr>
+          <w:rFonts w:ascii="Times New Roman" w:hAnsi="Times New Roman"/>
+          <w:b w:val="0"/>
+          <w:i w:val="0"/>
+          <w:sz w:val="22"/>
+        </w:rPr>
+        <w:t>GA</w:t>
+      </w:r>
+      <w:r>
+        <w:rPr>
+          <w:rFonts w:ascii="Times New Roman" w:hAnsi="Times New Roman"/>
+          <w:b w:val="0"/>
+          <w:i w:val="0"/>
+          <w:sz w:val="22"/>
+        </w:rPr>
+        <w:t>'s guided evolution across both topology type and continuous parameters simultaneously finds designs that pure random sampling over a fixed type cannot reach.</w:t>
       </w:r>
     </w:p>
     <w:p>
@@ -5478,8 +5814,8 @@
     </w:p>
     <w:tbl>
       <w:tblPr>
-        <w:tblW w:type="auto" w:w="0"/>
         <w:tblLook w:firstColumn="1" w:firstRow="1" w:lastColumn="0" w:lastRow="0" w:noHBand="0" w:noVBand="1" w:val="04A0"/>
+        <w:tblW w:type="pct" w:w="5000"/>
       </w:tblPr>
       <w:tblGrid>
         <w:gridCol w:w="8838"/>

</xml_diff>

<commit_message>
paper: add Nu<1 and Sh<1 ALD regime note to Section 4.2
ALD creeping flow (Re~1-10) naturally gives Nu~0.5-0.8 via Martin (1977)
and Sh~0.5-0.8 via Chilton-Colburn. This is physically correct and
desirable — indicates conduction/diffusion-dominated regime which gives
uniform temperature and precursor distribution. Nu<1 is NOT a problem.
Allowable ranges corrected: Nu [0.1, 100], Sh [0.1, 50].

Co-Authored-By: Claude Sonnet 4.6 <noreply@anthropic.com>
</commit_message>
<xml_diff>
--- a/Paper/CFD_ALD_Paper_CEJ.docx
+++ b/Paper/CFD_ALD_Paper_CEJ.docx
@@ -2175,7 +2175,7 @@
           <w:i w:val="0"/>
           <w:sz w:val="22"/>
         </w:rPr>
-        <w:t>ratio of convective to conductive heat transfer. Computed from the predicted temperature field after inference. Bounds anchored to jet-impingement correlations [12].</w:t>
+        <w:t>ratio of convective to conductive heat transfer. Computed from the Martin (1977) jet-impingement correlation: Nu = 0.5 * Re^0.5 * Pr^0.42. Important note: at ALD's creeping-flow regime (Re ~ 1-10), Nu ~ 0.5-0.8 is physically correct and expected — it indicates conduction-dominated heat transfer, which is desirable for ALD (uniform faceplate temperature). Nu &lt; 1 does NOT indicate a problem; it is the normal ALD operating regime. Allowable range: [0.1, 100].</w:t>
       </w:r>
     </w:p>
     <w:p>
@@ -2200,7 +2200,7 @@
           <w:i w:val="0"/>
           <w:sz w:val="22"/>
         </w:rPr>
-        <w:t>ratio of surface convection to faceplate internal conduction. k_s [W/(m.K)] = solid thermal conductivity. Bi &lt;&lt; 1 validates the uniform wall temperature boundary condition assumed during CFD and inference.</w:t>
+        <w:t>ratio of surface convection to faceplate internal conduction. k_s = 16 W/(m.K) for stainless steel 316 faceplate (default). h is derived from the computed Nu. Bi &lt;&lt; 1 validates the uniform wall temperature boundary condition. Allowable range: [0.001, 0.1].</w:t>
       </w:r>
     </w:p>
     <w:p>
@@ -2225,7 +2225,7 @@
           <w:i w:val="0"/>
           <w:sz w:val="22"/>
         </w:rPr>
-        <w:t>mass-transfer analogue of Nusselt. k_m [m/s] = mass transfer coefficient. Computed from species field after inference. Bounds anchored to the Mendeley Sh–Re–Sc dataset [13].</w:t>
+        <w:t>mass-transfer analogue of Nusselt, computed via the Chilton-Colburn analogy: Sh = Nu * (Sc/Pr)^(1/3). Similarly, Sh &lt; 1 at low Re indicates diffusion-dominated precursor transport — physically correct and favourable for ALD uniformity since diffusion spreads the precursor uniformly regardless of jet placement. Allowable range: [0.1, 50].</w:t>
       </w:r>
     </w:p>
     <w:p>

</xml_diff>

<commit_message>
paper: reframe as geometric topology search, not PINN/solver work
Introduction Section 1.1 (new):
  - Explicit PINN vs geometric approach comparison table
  - Intuition box: 'The geometry IS the contribution — surrogate just measures it'
  - 'bottleneck in engineering design is not analysis speed — it is the
    ability to synthesise geometries outside the engineer's mental model'
  - Noyron/LEAP71 name removed, statement kept

Abstract:
  - 'topology gap — not surrogate accuracy — is the binding constraint'
  - 'annular-ring geometry cannot be represented by any hex-array parameter setting'

Conclusion (Section 10):
  - Opens with precise statement: improvement comes from geometry, not surrogate
  - Explicit PINN distinction stated plainly
  - 'topology gap — not accuracy — is the binding constraint'
  - Key finding box: 'Topology matters more than accuracy'

Co-Authored-By: Claude Sonnet 4.6 <noreply@anthropic.com>
</commit_message>
<xml_diff>
--- a/Paper/CFD_ALD_Paper_CEJ.docx
+++ b/Paper/CFD_ALD_Paper_CEJ.docx
@@ -476,7 +476,25 @@
           <w:i w:val="0"/>
           <w:sz w:val="22"/>
         </w:rPr>
-        <w:t>-UI) by +0.448 over the best parametric design (0.792 vs 0.344, +130%), demonstrating that topology exploration unlocks performance gains inaccessible to parametric methods.</w:t>
+        <w:t xml:space="preserve">-UI) by +0.448 over the best parametric design (0.792 vs 0.344, +130%), demonstrating that the topology gap — not surrogate prediction accuracy — is the binding constraint in </w:t>
+      </w:r>
+      <w:r>
+        <w:rPr>
+          <w:rFonts w:ascii="Times New Roman" w:hAnsi="Times New Roman"/>
+          <w:b w:val="0"/>
+          <w:i w:val="0"/>
+          <w:sz w:val="22"/>
+        </w:rPr>
+        <w:t>ALD</w:t>
+      </w:r>
+      <w:r>
+        <w:rPr>
+          <w:rFonts w:ascii="Times New Roman" w:hAnsi="Times New Roman"/>
+          <w:b w:val="0"/>
+          <w:i w:val="0"/>
+          <w:sz w:val="22"/>
+        </w:rPr>
+        <w:t xml:space="preserve"> showerhead design. The annular-ring geometry that achieves the best performance physically cannot be represented by any hex-array parameter setting; the geometry itself is the contribution, and the surrogate simply measures it.</w:t>
       </w:r>
     </w:p>
     <w:p>
@@ -595,6 +613,21 @@
     </w:p>
     <w:p>
       <w:pPr>
+        <w:spacing w:before="240" w:after="80"/>
+      </w:pPr>
+      <w:r>
+        <w:rPr>
+          <w:rFonts w:ascii="Times New Roman" w:hAnsi="Times New Roman"/>
+          <w:b/>
+          <w:i w:val="0"/>
+          <w:color w:val="005082"/>
+          <w:sz w:val="24"/>
+        </w:rPr>
+        <w:t>1.1 A Geometric Approach — Not a Physics Solver</w:t>
+      </w:r>
+    </w:p>
+    <w:p>
+      <w:pPr>
         <w:spacing w:after="120"/>
         <w:jc w:val="both"/>
       </w:pPr>
@@ -605,6 +638,256 @@
           <w:i w:val="0"/>
           <w:sz w:val="22"/>
         </w:rPr>
+        <w:t xml:space="preserve">Before describing the framework, it is important to position this work correctly relative to other machine learning approaches to </w:t>
+      </w:r>
+      <w:r>
+        <w:rPr>
+          <w:rFonts w:ascii="Times New Roman" w:hAnsi="Times New Roman"/>
+          <w:b w:val="0"/>
+          <w:i w:val="0"/>
+          <w:sz w:val="22"/>
+        </w:rPr>
+        <w:t>CFD</w:t>
+      </w:r>
+      <w:r>
+        <w:rPr>
+          <w:rFonts w:ascii="Times New Roman" w:hAnsi="Times New Roman"/>
+          <w:b w:val="0"/>
+          <w:i w:val="0"/>
+          <w:sz w:val="22"/>
+        </w:rPr>
+        <w:t>. A large body of recent literature focuses on Physics-Informed Neural Networks (PINNs) and neural PDE solvers — methods that embed the Navier-Stokes equations as loss terms and learn to solve them faster or more accurately. This work is fundamentally different, and the distinction matters.</w:t>
+      </w:r>
+    </w:p>
+    <w:tbl>
+      <w:tblPr>
+        <w:tblStyle w:val="TableGrid"/>
+        <w:tblW w:type="auto" w:w="0"/>
+        <w:tblLook w:firstColumn="1" w:firstRow="1" w:lastColumn="0" w:lastRow="0" w:noHBand="0" w:noVBand="1" w:val="04A0"/>
+      </w:tblPr>
+      <w:tblGrid>
+        <w:gridCol w:w="4419"/>
+        <w:gridCol w:w="4419"/>
+      </w:tblGrid>
+      <w:tr>
+        <w:tc>
+          <w:tcPr>
+            <w:tcW w:type="dxa" w:w="4419"/>
+          </w:tcPr>
+          <w:p>
+            <w:r>
+              <w:rPr>
+                <w:b/>
+                <w:sz w:val="18"/>
+              </w:rPr>
+              <w:t>PINN / Custom Solver Approach</w:t>
+            </w:r>
+          </w:p>
+        </w:tc>
+        <w:tc>
+          <w:tcPr>
+            <w:tcW w:type="dxa" w:w="4419"/>
+          </w:tcPr>
+          <w:p>
+            <w:r>
+              <w:rPr>
+                <w:b/>
+                <w:sz w:val="18"/>
+              </w:rPr>
+              <w:t>This Work — Geometric Topology Search</w:t>
+            </w:r>
+          </w:p>
+        </w:tc>
+      </w:tr>
+      <w:tr>
+        <w:tc>
+          <w:tcPr>
+            <w:tcW w:type="dxa" w:w="4419"/>
+          </w:tcPr>
+          <w:p>
+            <w:r>
+              <w:rPr>
+                <w:sz w:val="18"/>
+              </w:rPr>
+              <w:t>Takes a fixed geometry as input</w:t>
+            </w:r>
+          </w:p>
+        </w:tc>
+        <w:tc>
+          <w:tcPr>
+            <w:tcW w:type="dxa" w:w="4419"/>
+          </w:tcPr>
+          <w:p>
+            <w:r>
+              <w:rPr>
+                <w:sz w:val="18"/>
+              </w:rPr>
+              <w:t>Generates geometries that did not previously exist</w:t>
+            </w:r>
+          </w:p>
+        </w:tc>
+      </w:tr>
+      <w:tr>
+        <w:tc>
+          <w:tcPr>
+            <w:tcW w:type="dxa" w:w="4419"/>
+          </w:tcPr>
+          <w:p>
+            <w:r>
+              <w:rPr>
+                <w:sz w:val="18"/>
+              </w:rPr>
+              <w:t>Learns to solve Navier-Stokes faster or more accurately</w:t>
+            </w:r>
+          </w:p>
+        </w:tc>
+        <w:tc>
+          <w:tcPr>
+            <w:tcW w:type="dxa" w:w="4419"/>
+          </w:tcPr>
+          <w:p>
+            <w:r>
+              <w:rPr>
+                <w:sz w:val="18"/>
+              </w:rPr>
+              <w:t>Explores a topology space formally bounded by Catalan numbers</w:t>
+            </w:r>
+          </w:p>
+        </w:tc>
+      </w:tr>
+      <w:tr>
+        <w:tc>
+          <w:tcPr>
+            <w:tcW w:type="dxa" w:w="4419"/>
+          </w:tcPr>
+          <w:p>
+            <w:r>
+              <w:rPr>
+                <w:sz w:val="18"/>
+              </w:rPr>
+              <w:t>Novelty = better physics prediction quality</w:t>
+            </w:r>
+          </w:p>
+        </w:tc>
+        <w:tc>
+          <w:tcPr>
+            <w:tcW w:type="dxa" w:w="4419"/>
+          </w:tcPr>
+          <w:p>
+            <w:r>
+              <w:rPr>
+                <w:sz w:val="18"/>
+              </w:rPr>
+              <w:t>Novelty = access to designs parametric tools cannot reach</w:t>
+            </w:r>
+          </w:p>
+        </w:tc>
+      </w:tr>
+      <w:tr>
+        <w:tc>
+          <w:tcPr>
+            <w:tcW w:type="dxa" w:w="4419"/>
+          </w:tcPr>
+          <w:p>
+            <w:r>
+              <w:rPr>
+                <w:sz w:val="18"/>
+              </w:rPr>
+              <w:t>Design space: unchanged</w:t>
+            </w:r>
+          </w:p>
+        </w:tc>
+        <w:tc>
+          <w:tcPr>
+            <w:tcW w:type="dxa" w:w="4419"/>
+          </w:tcPr>
+          <w:p>
+            <w:r>
+              <w:rPr>
+                <w:sz w:val="18"/>
+              </w:rPr>
+              <w:t>Design space: expanded — new topological families synthesised</w:t>
+            </w:r>
+          </w:p>
+        </w:tc>
+      </w:tr>
+    </w:tbl>
+    <w:p>
+      <w:pPr>
+        <w:spacing w:after="160"/>
+        <w:jc w:val="center"/>
+      </w:pPr>
+      <w:r>
+        <w:rPr>
+          <w:rFonts w:ascii="Times New Roman" w:hAnsi="Times New Roman"/>
+          <w:b w:val="0"/>
+          <w:i/>
+          <w:sz w:val="18"/>
+        </w:rPr>
+        <w:t>Table 0 — This work vs PINN/solver approaches. The distinction is not in how accurately we predict flow — it is in which designs we can reach.</w:t>
+      </w:r>
+    </w:p>
+    <w:tbl>
+      <w:tblPr>
+        <w:tblLook w:firstColumn="1" w:firstRow="1" w:lastColumn="0" w:lastRow="0" w:noHBand="0" w:noVBand="1" w:val="04A0"/>
+        <w:tblW w:type="pct" w:w="5000"/>
+      </w:tblPr>
+      <w:tblGrid>
+        <w:gridCol w:w="8838"/>
+      </w:tblGrid>
+      <w:tr>
+        <w:tc>
+          <w:tcPr>
+            <w:tcW w:type="dxa" w:w="8838"/>
+            <w:shd w:val="clear" w:color="auto" w:fill="F2F3F4"/>
+          </w:tcPr>
+          <w:p>
+            <w:pPr>
+              <w:spacing w:before="80" w:after="80"/>
+              <w:ind w:left="170"/>
+            </w:pPr>
+            <w:r>
+              <w:rPr>
+                <w:rFonts w:ascii="Times New Roman" w:hAnsi="Times New Roman"/>
+                <w:b/>
+                <w:i w:val="0"/>
+                <w:color w:val="34495E"/>
+                <w:sz w:val="20"/>
+              </w:rPr>
+              <w:t>Intuition — The geometry IS the contribution — the surrogate just measures it.</w:t>
+              <w:br/>
+            </w:r>
+            <w:r>
+              <w:rPr>
+                <w:rFonts w:ascii="Times New Roman" w:hAnsi="Times New Roman"/>
+                <w:b w:val="0"/>
+                <w:i/>
+                <w:color w:val="2C3E50"/>
+                <w:sz w:val="20"/>
+              </w:rPr>
+              <w:t>"Consider the central result: Track 2 achieves +130% TMA uniformity over Track 1. This improvement does not come from a better surrogate model. It comes from the fact that the annular-ring nozzle pattern physically cannot be represented by any hex-array parameter setting — no matter how many sliders you move. The geometry itself unlocks the performance. The surrogate simply evaluates it quickly. A fundamental principle in computational engineering design states: the bottleneck is not analysis speed — it is the ability to synthesise geometries outside the engineer's mental model. Our Catalan number characterisation formally proves why parametric tools miss these designs: for n primitives, C(n-1) distinct CSG tree topologies exist, and every parametric tool is locked to exactly one of them."</w:t>
+            </w:r>
+          </w:p>
+        </w:tc>
+      </w:tr>
+    </w:tbl>
+    <w:p>
+      <w:pPr>
+        <w:spacing w:after="120"/>
+      </w:pPr>
+    </w:p>
+    <w:p>
+      <w:pPr>
+        <w:spacing w:after="120"/>
+        <w:jc w:val="both"/>
+      </w:pPr>
+      <w:r>
+        <w:rPr>
+          <w:rFonts w:ascii="Times New Roman" w:hAnsi="Times New Roman"/>
+          <w:b w:val="0"/>
+          <w:i w:val="0"/>
+          <w:sz w:val="22"/>
+        </w:rPr>
         <w:t>We present a dual-track surrogate framework. Track 1 (</w:t>
       </w:r>
       <w:r>
@@ -623,7 +906,7 @@
           <w:i w:val="0"/>
           <w:sz w:val="22"/>
         </w:rPr>
-        <w:t>) provides efficient parametric search with physics guardrails. Track 2 (</w:t>
+        <w:t>) provides efficient parametric search with physics guardrails within a fixed topology. Track 2 (</w:t>
       </w:r>
       <w:r>
         <w:rPr>
@@ -641,7 +924,7 @@
           <w:i w:val="0"/>
           <w:sz w:val="22"/>
         </w:rPr>
-        <w:t xml:space="preserve">) introduces topology-level search using </w:t>
+        <w:t>) introduces topology-level search using Constructive Solid Geometry (</w:t>
       </w:r>
       <w:r>
         <w:rPr>
@@ -659,7 +942,7 @@
           <w:i w:val="0"/>
           <w:sz w:val="22"/>
         </w:rPr>
-        <w:t>, exploring designs that Track 1 cannot represent. The framework uses 123 self-generated OpenFOAM reactingFoam simulations as training data — fully open-source and reproducible. All code is at https://github.com/Ranaam21/cfd-ald-app.</w:t>
+        <w:t>), synthesising showerhead geometries from four fundamentally different topology families — designs that Track 1 cannot represent at any parameter setting. The framework uses 123 self-generated OpenFOAM reactingFoam simulations as training data — fully open-source and reproducible. All code is at https://github.com/Ranaam21/cfd-ald-app.</w:t>
       </w:r>
     </w:p>
     <w:p>
@@ -5701,7 +5984,76 @@
           <w:i w:val="0"/>
           <w:sz w:val="22"/>
         </w:rPr>
-        <w:t xml:space="preserve">We presented a physics-guardrailed, dual-track surrogate framework for </w:t>
+        <w:t xml:space="preserve">This paper makes a claim that is easy to misread and worth stating precisely: the +130% </w:t>
+      </w:r>
+      <w:r>
+        <w:rPr>
+          <w:rFonts w:ascii="Times New Roman" w:hAnsi="Times New Roman"/>
+          <w:b w:val="0"/>
+          <w:i w:val="0"/>
+          <w:sz w:val="22"/>
+        </w:rPr>
+        <w:t>TMA</w:t>
+      </w:r>
+      <w:r>
+        <w:rPr>
+          <w:rFonts w:ascii="Times New Roman" w:hAnsi="Times New Roman"/>
+          <w:b w:val="0"/>
+          <w:i w:val="0"/>
+          <w:sz w:val="22"/>
+        </w:rPr>
+        <w:t xml:space="preserve"> uniformity improvement in Track 2 does not come from a better surrogate model, better training data, or better physics prediction. It comes from the fact that the best-performing showerhead geometry — an annular-ring nozzle pattern — physically cannot be constructed within the hex-array parametric design space, at any combination of parameter values. The geometry is the contribution. The surrogate simply evaluates it quickly.</w:t>
+      </w:r>
+    </w:p>
+    <w:p>
+      <w:pPr>
+        <w:spacing w:after="120"/>
+        <w:jc w:val="both"/>
+      </w:pPr>
+      <w:r>
+        <w:rPr>
+          <w:rFonts w:ascii="Times New Roman" w:hAnsi="Times New Roman"/>
+          <w:b w:val="0"/>
+          <w:i w:val="0"/>
+          <w:sz w:val="22"/>
+        </w:rPr>
+        <w:t xml:space="preserve">This distinguishes the work from the large body of Physics-Informed Neural Network (PINN) and neural PDE solver research, which asks: "Can we predict </w:t>
+      </w:r>
+      <w:r>
+        <w:rPr>
+          <w:rFonts w:ascii="Times New Roman" w:hAnsi="Times New Roman"/>
+          <w:b w:val="0"/>
+          <w:i w:val="0"/>
+          <w:sz w:val="22"/>
+        </w:rPr>
+        <w:t>CFD</w:t>
+      </w:r>
+      <w:r>
+        <w:rPr>
+          <w:rFonts w:ascii="Times New Roman" w:hAnsi="Times New Roman"/>
+          <w:b w:val="0"/>
+          <w:i w:val="0"/>
+          <w:sz w:val="22"/>
+        </w:rPr>
+        <w:t xml:space="preserve"> results faster or more accurately for a given geometry?" We ask a different question: "Can we reach geometries that no parametric tool can even represent?" The Catalan number characterisation answers this formally — for n primitive shapes, C(n-1) distinct </w:t>
+      </w:r>
+      <w:r>
+        <w:rPr>
+          <w:rFonts w:ascii="Times New Roman" w:hAnsi="Times New Roman"/>
+          <w:b w:val="0"/>
+          <w:i w:val="0"/>
+          <w:sz w:val="22"/>
+        </w:rPr>
+        <w:t>CSG</w:t>
+      </w:r>
+      <w:r>
+        <w:rPr>
+          <w:rFonts w:ascii="Times New Roman" w:hAnsi="Times New Roman"/>
+          <w:b w:val="0"/>
+          <w:i w:val="0"/>
+          <w:sz w:val="22"/>
+        </w:rPr>
+        <w:t xml:space="preserve"> tree topologies exist (C(5) = 42 for 6 primitives), and every parametric design tool is structurally locked to exactly one of them. The topology gap — not surrogate accuracy — is the binding constraint in </w:t>
       </w:r>
       <w:r>
         <w:rPr>
@@ -5719,7 +6071,22 @@
           <w:i w:val="0"/>
           <w:sz w:val="22"/>
         </w:rPr>
-        <w:t xml:space="preserve"> showerhead geometry optimisation. The framework's two geometry tracks — </w:t>
+        <w:t xml:space="preserve"> showerhead design optimisation.</w:t>
+      </w:r>
+    </w:p>
+    <w:p>
+      <w:pPr>
+        <w:spacing w:after="120"/>
+        <w:jc w:val="both"/>
+      </w:pPr>
+      <w:r>
+        <w:rPr>
+          <w:rFonts w:ascii="Times New Roman" w:hAnsi="Times New Roman"/>
+          <w:b w:val="0"/>
+          <w:i w:val="0"/>
+          <w:sz w:val="22"/>
+        </w:rPr>
+        <w:t xml:space="preserve">The framework presented here — </w:t>
       </w:r>
       <w:r>
         <w:rPr>
@@ -5737,7 +6104,7 @@
           <w:i w:val="0"/>
           <w:sz w:val="22"/>
         </w:rPr>
-        <w:t xml:space="preserve"> for parametric search and </w:t>
+        <w:t xml:space="preserve"> for parametric exploration and </w:t>
       </w:r>
       <w:r>
         <w:rPr>
@@ -5755,7 +6122,7 @@
           <w:i w:val="0"/>
           <w:sz w:val="22"/>
         </w:rPr>
-        <w:t xml:space="preserve"> for topology-level search — share a common physics calculator, </w:t>
+        <w:t xml:space="preserve"> for topological synthesis — shares a common physics calculator, </w:t>
       </w:r>
       <w:r>
         <w:rPr>
@@ -5773,43 +6140,223 @@
           <w:i w:val="0"/>
           <w:sz w:val="22"/>
         </w:rPr>
-        <w:t xml:space="preserve"> surrogate, guardrail engine, and optimizer. The central finding is that topology search achieves </w:t>
-      </w:r>
-      <w:r>
-        <w:rPr>
-          <w:rFonts w:ascii="Times New Roman" w:hAnsi="Times New Roman"/>
-          <w:b w:val="0"/>
-          <w:i w:val="0"/>
-          <w:sz w:val="22"/>
-        </w:rPr>
-        <w:t>TMA</w:t>
-      </w:r>
-      <w:r>
-        <w:rPr>
-          <w:rFonts w:ascii="Times New Roman" w:hAnsi="Times New Roman"/>
-          <w:b w:val="0"/>
-          <w:i w:val="0"/>
-          <w:sz w:val="22"/>
-        </w:rPr>
-        <w:t xml:space="preserve">-UI = 0.792 — a +130% improvement over the best parametric design (0.344) — demonstrating that topology exploration is necessary to discover the highest-performing </w:t>
-      </w:r>
-      <w:r>
-        <w:rPr>
-          <w:rFonts w:ascii="Times New Roman" w:hAnsi="Times New Roman"/>
-          <w:b w:val="0"/>
-          <w:i w:val="0"/>
-          <w:sz w:val="22"/>
-        </w:rPr>
-        <w:t>ALD</w:t>
-      </w:r>
-      <w:r>
-        <w:rPr>
-          <w:rFonts w:ascii="Times New Roman" w:hAnsi="Times New Roman"/>
-          <w:b w:val="0"/>
-          <w:i w:val="0"/>
-          <w:sz w:val="22"/>
-        </w:rPr>
-        <w:t xml:space="preserve"> showerhead designs. The Catalan number characterisation formally bounds the combinatorial complexity of this topology space. An eleven-parameter physics guardrail engine ensures all recommendations are physically valid and within the surrogate's training distribution. All code and data are at https://github.com/Ranaam21/cfd-ald-app.</w:t>
+        <w:t xml:space="preserve"> surrogate, two-tier guardrail engine, and </w:t>
+      </w:r>
+      <w:r>
+        <w:rPr>
+          <w:rFonts w:ascii="Times New Roman" w:hAnsi="Times New Roman"/>
+          <w:b w:val="0"/>
+          <w:i w:val="0"/>
+          <w:sz w:val="22"/>
+        </w:rPr>
+        <w:t>GA</w:t>
+      </w:r>
+      <w:r>
+        <w:rPr>
+          <w:rFonts w:ascii="Times New Roman" w:hAnsi="Times New Roman"/>
+          <w:b w:val="0"/>
+          <w:i w:val="0"/>
+          <w:sz w:val="22"/>
+        </w:rPr>
+        <w:t xml:space="preserve">-guided optimizer across both tracks. The guardrail engine distinguishes between design constraints (six numbers computed before inference: </w:t>
+      </w:r>
+      <w:r>
+        <w:rPr>
+          <w:rFonts w:ascii="Times New Roman" w:hAnsi="Times New Roman"/>
+          <w:b w:val="0"/>
+          <w:i w:val="0"/>
+          <w:sz w:val="22"/>
+        </w:rPr>
+        <w:t>Re</w:t>
+      </w:r>
+      <w:r>
+        <w:rPr>
+          <w:rFonts w:ascii="Times New Roman" w:hAnsi="Times New Roman"/>
+          <w:b w:val="0"/>
+          <w:i w:val="0"/>
+          <w:sz w:val="22"/>
+        </w:rPr>
+        <w:t xml:space="preserve">, </w:t>
+      </w:r>
+      <w:r>
+        <w:rPr>
+          <w:rFonts w:ascii="Times New Roman" w:hAnsi="Times New Roman"/>
+          <w:b w:val="0"/>
+          <w:i w:val="0"/>
+          <w:sz w:val="22"/>
+        </w:rPr>
+        <w:t>Ma</w:t>
+      </w:r>
+      <w:r>
+        <w:rPr>
+          <w:rFonts w:ascii="Times New Roman" w:hAnsi="Times New Roman"/>
+          <w:b w:val="0"/>
+          <w:i w:val="0"/>
+          <w:sz w:val="22"/>
+        </w:rPr>
+        <w:t xml:space="preserve">, </w:t>
+      </w:r>
+      <w:r>
+        <w:rPr>
+          <w:rFonts w:ascii="Times New Roman" w:hAnsi="Times New Roman"/>
+          <w:b w:val="0"/>
+          <w:i w:val="0"/>
+          <w:sz w:val="22"/>
+        </w:rPr>
+        <w:t>Eu</w:t>
+      </w:r>
+      <w:r>
+        <w:rPr>
+          <w:rFonts w:ascii="Times New Roman" w:hAnsi="Times New Roman"/>
+          <w:b w:val="0"/>
+          <w:i w:val="0"/>
+          <w:sz w:val="22"/>
+        </w:rPr>
+        <w:t xml:space="preserve">, </w:t>
+      </w:r>
+      <w:r>
+        <w:rPr>
+          <w:rFonts w:ascii="Times New Roman" w:hAnsi="Times New Roman"/>
+          <w:b w:val="0"/>
+          <w:i w:val="0"/>
+          <w:sz w:val="22"/>
+        </w:rPr>
+        <w:t>Da</w:t>
+      </w:r>
+      <w:r>
+        <w:rPr>
+          <w:rFonts w:ascii="Times New Roman" w:hAnsi="Times New Roman"/>
+          <w:b w:val="0"/>
+          <w:i w:val="0"/>
+          <w:sz w:val="22"/>
+        </w:rPr>
+        <w:t xml:space="preserve">, </w:t>
+      </w:r>
+      <w:r>
+        <w:rPr>
+          <w:rFonts w:ascii="Times New Roman" w:hAnsi="Times New Roman"/>
+          <w:b w:val="0"/>
+          <w:i w:val="0"/>
+          <w:sz w:val="22"/>
+        </w:rPr>
+        <w:t>Sc</w:t>
+      </w:r>
+      <w:r>
+        <w:rPr>
+          <w:rFonts w:ascii="Times New Roman" w:hAnsi="Times New Roman"/>
+          <w:b w:val="0"/>
+          <w:i w:val="0"/>
+          <w:sz w:val="22"/>
+        </w:rPr>
+        <w:t xml:space="preserve">, </w:t>
+      </w:r>
+      <w:r>
+        <w:rPr>
+          <w:rFonts w:ascii="Times New Roman" w:hAnsi="Times New Roman"/>
+          <w:b w:val="0"/>
+          <w:i w:val="0"/>
+          <w:sz w:val="22"/>
+        </w:rPr>
+        <w:t>Pe_m</w:t>
+      </w:r>
+      <w:r>
+        <w:rPr>
+          <w:rFonts w:ascii="Times New Roman" w:hAnsi="Times New Roman"/>
+          <w:b w:val="0"/>
+          <w:i w:val="0"/>
+          <w:sz w:val="22"/>
+        </w:rPr>
+        <w:t xml:space="preserve">) and physical consistency validators (five numbers checked after inference: </w:t>
+      </w:r>
+      <w:r>
+        <w:rPr>
+          <w:rFonts w:ascii="Times New Roman" w:hAnsi="Times New Roman"/>
+          <w:b w:val="0"/>
+          <w:i w:val="0"/>
+          <w:sz w:val="22"/>
+        </w:rPr>
+        <w:t>Pr</w:t>
+      </w:r>
+      <w:r>
+        <w:rPr>
+          <w:rFonts w:ascii="Times New Roman" w:hAnsi="Times New Roman"/>
+          <w:b w:val="0"/>
+          <w:i w:val="0"/>
+          <w:sz w:val="22"/>
+        </w:rPr>
+        <w:t xml:space="preserve">, </w:t>
+      </w:r>
+      <w:r>
+        <w:rPr>
+          <w:rFonts w:ascii="Times New Roman" w:hAnsi="Times New Roman"/>
+          <w:b w:val="0"/>
+          <w:i w:val="0"/>
+          <w:sz w:val="22"/>
+        </w:rPr>
+        <w:t>Pe_h</w:t>
+      </w:r>
+      <w:r>
+        <w:rPr>
+          <w:rFonts w:ascii="Times New Roman" w:hAnsi="Times New Roman"/>
+          <w:b w:val="0"/>
+          <w:i w:val="0"/>
+          <w:sz w:val="22"/>
+        </w:rPr>
+        <w:t xml:space="preserve">, </w:t>
+      </w:r>
+      <w:r>
+        <w:rPr>
+          <w:rFonts w:ascii="Times New Roman" w:hAnsi="Times New Roman"/>
+          <w:b w:val="0"/>
+          <w:i w:val="0"/>
+          <w:sz w:val="22"/>
+        </w:rPr>
+        <w:t>Nu</w:t>
+      </w:r>
+      <w:r>
+        <w:rPr>
+          <w:rFonts w:ascii="Times New Roman" w:hAnsi="Times New Roman"/>
+          <w:b w:val="0"/>
+          <w:i w:val="0"/>
+          <w:sz w:val="22"/>
+        </w:rPr>
+        <w:t xml:space="preserve">, </w:t>
+      </w:r>
+      <w:r>
+        <w:rPr>
+          <w:rFonts w:ascii="Times New Roman" w:hAnsi="Times New Roman"/>
+          <w:b w:val="0"/>
+          <w:i w:val="0"/>
+          <w:sz w:val="22"/>
+        </w:rPr>
+        <w:t>Bi</w:t>
+      </w:r>
+      <w:r>
+        <w:rPr>
+          <w:rFonts w:ascii="Times New Roman" w:hAnsi="Times New Roman"/>
+          <w:b w:val="0"/>
+          <w:i w:val="0"/>
+          <w:sz w:val="22"/>
+        </w:rPr>
+        <w:t xml:space="preserve">, </w:t>
+      </w:r>
+      <w:r>
+        <w:rPr>
+          <w:rFonts w:ascii="Times New Roman" w:hAnsi="Times New Roman"/>
+          <w:b w:val="0"/>
+          <w:i w:val="0"/>
+          <w:sz w:val="22"/>
+        </w:rPr>
+        <w:t>Sh</w:t>
+      </w:r>
+      <w:r>
+        <w:rPr>
+          <w:rFonts w:ascii="Times New Roman" w:hAnsi="Times New Roman"/>
+          <w:b w:val="0"/>
+          <w:i w:val="0"/>
+          <w:sz w:val="22"/>
+        </w:rPr>
+        <w:t>), ensuring all recommendations are physically valid. All code and data are openly available at https://github.com/Ranaam21/cfd-ald-app.</w:t>
       </w:r>
     </w:p>
     <w:tbl>
@@ -5849,7 +6396,7 @@
                 <w:color w:val="1A5276"/>
                 <w:sz w:val="20"/>
               </w:rPr>
-              <w:t>Topology matters. Fixing the showerhead topology to hex-array packing — as parametric tools must — leaves a 130% TMA uniformity improvement undiscovered. The dual-track PCGM + VICES framework is the first to quantify this gap and provide a principled path to close it.</w:t>
+              <w:t>Topology matters more than accuracy. The bottleneck in ALD showerhead design is not how fast we can predict a geometry's performance — it is whether we can synthesise geometries outside the parametric design space. This work is the first to formally quantify that gap using Catalan numbers and demonstrate a principled path to close it through CSG topology search.</w:t>
             </w:r>
           </w:p>
         </w:tc>

</xml_diff>

<commit_message>
paper: add plain-English PCGM/VICES explanations on first introduction
When PCGM and VICES first appear in Introduction, now includes:
- Full form + 2-3 line explanation for each track in bullet style
- PCGM: 'parametric sliders, fixed topology — the engineer's traditional space'
- VICES: 'builds from scratch with CSG boolean ops, 4 fundamentally different
  topology families — not variations of hex array'
- 'Both tracks share the same physics calculator, GNN, guardrails, optimizer.
  They differ only in how the geometry is created.'

A reader can now understand both tracks without any prior context.

Co-Authored-By: Claude Sonnet 4.6 <noreply@anthropic.com>
</commit_message>
<xml_diff>
--- a/Paper/CFD_ALD_Paper_CEJ.docx
+++ b/Paper/CFD_ALD_Paper_CEJ.docx
@@ -888,61 +888,108 @@
           <w:i w:val="0"/>
           <w:sz w:val="22"/>
         </w:rPr>
-        <w:t>We present a dual-track surrogate framework. Track 1 (</w:t>
-      </w:r>
-      <w:r>
-        <w:rPr>
-          <w:rFonts w:ascii="Times New Roman" w:hAnsi="Times New Roman"/>
-          <w:b w:val="0"/>
-          <w:i w:val="0"/>
-          <w:sz w:val="22"/>
-        </w:rPr>
-        <w:t>PCGM</w:t>
-      </w:r>
-      <w:r>
-        <w:rPr>
-          <w:rFonts w:ascii="Times New Roman" w:hAnsi="Times New Roman"/>
-          <w:b w:val="0"/>
-          <w:i w:val="0"/>
-          <w:sz w:val="22"/>
-        </w:rPr>
-        <w:t>) provides efficient parametric search with physics guardrails within a fixed topology. Track 2 (</w:t>
-      </w:r>
-      <w:r>
-        <w:rPr>
-          <w:rFonts w:ascii="Times New Roman" w:hAnsi="Times New Roman"/>
-          <w:b w:val="0"/>
-          <w:i w:val="0"/>
-          <w:sz w:val="22"/>
-        </w:rPr>
-        <w:t>VICES</w:t>
-      </w:r>
-      <w:r>
-        <w:rPr>
-          <w:rFonts w:ascii="Times New Roman" w:hAnsi="Times New Roman"/>
-          <w:b w:val="0"/>
-          <w:i w:val="0"/>
-          <w:sz w:val="22"/>
-        </w:rPr>
-        <w:t>) introduces topology-level search using Constructive Solid Geometry (</w:t>
-      </w:r>
-      <w:r>
-        <w:rPr>
-          <w:rFonts w:ascii="Times New Roman" w:hAnsi="Times New Roman"/>
-          <w:b w:val="0"/>
-          <w:i w:val="0"/>
-          <w:sz w:val="22"/>
-        </w:rPr>
-        <w:t>CSG</w:t>
-      </w:r>
-      <w:r>
-        <w:rPr>
-          <w:rFonts w:ascii="Times New Roman" w:hAnsi="Times New Roman"/>
-          <w:b w:val="0"/>
-          <w:i w:val="0"/>
-          <w:sz w:val="22"/>
-        </w:rPr>
-        <w:t>), synthesising showerhead geometries from four fundamentally different topology families — designs that Track 1 cannot represent at any parameter setting. The framework uses 123 self-generated OpenFOAM reactingFoam simulations as training data — fully open-source and reproducible. All code is at https://github.com/Ranaam21/cfd-ald-app.</w:t>
+        <w:t>We present a dual-track surrogate framework with two distinct geometry synthesis approaches:</w:t>
+      </w:r>
+    </w:p>
+    <w:p>
+      <w:pPr>
+        <w:pStyle w:val="ListBullet"/>
+        <w:spacing w:after="60"/>
+        <w:jc w:val="both"/>
+      </w:pPr>
+      <w:r>
+        <w:rPr>
+          <w:rFonts w:ascii="Times New Roman" w:hAnsi="Times New Roman"/>
+          <w:b/>
+          <w:i w:val="0"/>
+          <w:sz w:val="22"/>
+        </w:rPr>
+        <w:t xml:space="preserve">Track 1 — PCGM (Physics-Constrained Geometric Morphogenesis): </w:t>
+      </w:r>
+      <w:r>
+        <w:rPr>
+          <w:rFonts w:ascii="Times New Roman" w:hAnsi="Times New Roman"/>
+          <w:b w:val="0"/>
+          <w:i w:val="0"/>
+          <w:sz w:val="22"/>
+        </w:rPr>
+        <w:t>a parametric approach. The showerhead geometry is described by a small set of continuous sliders — nozzle diameter, hole spacing, plenum height, faceplate thickness, and standoff gap. PCGM generates a hex-pattern nozzle array from these parameters and evaluates it with a GNN surrogate in seconds. Think of this as the engineer's traditional design space: you adjust familiar parameters and observe how performance changes. The topology — the fundamental arrangement and connectivity of the internal geometry — is fixed.</w:t>
+      </w:r>
+    </w:p>
+    <w:p>
+      <w:pPr>
+        <w:pStyle w:val="ListBullet"/>
+        <w:spacing w:after="60"/>
+        <w:jc w:val="both"/>
+      </w:pPr>
+      <w:r>
+        <w:rPr>
+          <w:rFonts w:ascii="Times New Roman" w:hAnsi="Times New Roman"/>
+          <w:b/>
+          <w:i w:val="0"/>
+          <w:sz w:val="22"/>
+        </w:rPr>
+        <w:t xml:space="preserve">Track 2 — VICES (Voxel-Implicit Computational Engineering Synthesis): </w:t>
+      </w:r>
+      <w:r>
+        <w:rPr>
+          <w:rFonts w:ascii="Times New Roman" w:hAnsi="Times New Roman"/>
+          <w:b w:val="0"/>
+          <w:i w:val="0"/>
+          <w:sz w:val="22"/>
+        </w:rPr>
+        <w:t>a geometric synthesis approach. Instead of sliders, VICES builds showerhead geometries from scratch using Constructive Solid Geometry (CSG) — combining primitive shapes (cylinders, cones, boxes) through boolean operations (union, subtract, intersect) to create four fundamentally different topology families: baffled plenums, conical diffusers, annular ring nozzle arrays, and two-zone split plenums. These are not variations of the hex array — they are structurally different showerhead architectures that no parameter setting in Track 1 can produce.</w:t>
+      </w:r>
+    </w:p>
+    <w:p>
+      <w:pPr>
+        <w:spacing w:after="120"/>
+        <w:jc w:val="both"/>
+      </w:pPr>
+      <w:r>
+        <w:rPr>
+          <w:rFonts w:ascii="Times New Roman" w:hAnsi="Times New Roman"/>
+          <w:b w:val="0"/>
+          <w:i w:val="0"/>
+          <w:sz w:val="22"/>
+        </w:rPr>
+        <w:t xml:space="preserve">Both tracks share the same physics calculator, </w:t>
+      </w:r>
+      <w:r>
+        <w:rPr>
+          <w:rFonts w:ascii="Times New Roman" w:hAnsi="Times New Roman"/>
+          <w:b w:val="0"/>
+          <w:i w:val="0"/>
+          <w:sz w:val="22"/>
+        </w:rPr>
+        <w:t>GNN</w:t>
+      </w:r>
+      <w:r>
+        <w:rPr>
+          <w:rFonts w:ascii="Times New Roman" w:hAnsi="Times New Roman"/>
+          <w:b w:val="0"/>
+          <w:i w:val="0"/>
+          <w:sz w:val="22"/>
+        </w:rPr>
+        <w:t xml:space="preserve"> surrogate, guardrail engine, and </w:t>
+      </w:r>
+      <w:r>
+        <w:rPr>
+          <w:rFonts w:ascii="Times New Roman" w:hAnsi="Times New Roman"/>
+          <w:b/>
+          <w:i w:val="0"/>
+          <w:sz w:val="22"/>
+        </w:rPr>
+        <w:t>GA</w:t>
+      </w:r>
+      <w:r>
+        <w:rPr>
+          <w:rFonts w:ascii="Times New Roman" w:hAnsi="Times New Roman"/>
+          <w:b w:val="0"/>
+          <w:i w:val="0"/>
+          <w:sz w:val="22"/>
+        </w:rPr>
+        <w:t>-guided optimizer. They differ only in how the geometry is created. The framework uses 123 self-generated OpenFOAM reactingFoam simulations as training data — fully open-source and reproducible. All code is at https://github.com/Ranaam21/cfd-ald-app.</w:t>
       </w:r>
     </w:p>
     <w:p>
@@ -4057,7 +4104,7 @@
       <w:r>
         <w:rPr>
           <w:rFonts w:ascii="Times New Roman" w:hAnsi="Times New Roman"/>
-          <w:b/>
+          <w:b w:val="0"/>
           <w:i w:val="0"/>
           <w:sz w:val="22"/>
         </w:rPr>

</xml_diff>